<commit_message>
Hai website theo bản kế hoạch có Năng lực số tuần 4-14 viết bám từng bài
Sinh lại 51 tệp KHDH và Word đính kèm sau khi 290 tiết của tuần 4 đến tuần 14 được viết
khối Năng lực số bám từng bài. Đo lại: 51/51 cặp khối x môn khớp app và khớp bản dùng chung.

Co-Authored-By: Claude Opus 5 <noreply@anthropic.com>
Claude-Session: https://claude.ai/code/session_01EQbWdA5TUDQ3hBC1ivA74a
</commit_message>
<xml_diff>
--- a/assets/docs/lop1/Dao duc - Lop 1.docx
+++ b/assets/docs/lop1/Dao duc - Lop 1.docx
@@ -1079,6 +1079,45 @@
                 <w:i w:val="0"/>
                 <w:sz w:val="18"/>
               </w:rPr>
+              <w:t>NLS-KT (Cơ bản 1): GV chiếu phóng to tranh Khám phá của bài “Em giữ trang phục gọn gàng, sạch sẽ” và thêm vài ảnh thật: áo bỏ trong quần</w:t>
+            </w:r>
+          </w:p>
+          <w:p>
+            <w:pPr>
+              <w:spacing w:after="0"/>
+            </w:pPr>
+            <w:r>
+              <w:rPr>
+                <w:b w:val="0"/>
+                <w:i w:val="0"/>
+                <w:sz w:val="18"/>
+              </w:rPr>
+              <w:t>NLS-GQVĐ (Cơ bản 1): GV mở bài tập tương tác sắp các bước mặc áo và chỉnh trang phục theo đúng thứ tự: mặc áo, cài cúc từ dưới lên</w:t>
+            </w:r>
+          </w:p>
+          <w:p>
+            <w:pPr>
+              <w:spacing w:after="0"/>
+            </w:pPr>
+            <w:r>
+              <w:rPr>
+                <w:b w:val="0"/>
+                <w:i w:val="0"/>
+                <w:sz w:val="18"/>
+              </w:rPr>
+              <w:t>NLS-AT: Máy do cô giáo bấm, HS chờ đến lượt được mời</w:t>
+            </w:r>
+          </w:p>
+          <w:p>
+            <w:pPr>
+              <w:spacing w:after="0"/>
+            </w:pPr>
+            <w:r>
+              <w:rPr>
+                <w:b w:val="0"/>
+                <w:i w:val="0"/>
+                <w:sz w:val="18"/>
+              </w:rPr>
               <w:t>KNS: KN tự phục vụ: tự làm lấy việc của mình, giữ gìn vệ sinh cá nhân và nơi ở.</w:t>
             </w:r>
           </w:p>
@@ -1196,7 +1235,7 @@
                 <w:i w:val="0"/>
                 <w:sz w:val="18"/>
               </w:rPr>
-              <w:t>NLS-KT (Cơ bản 1): GV chiếu đoạn phim tình huống gia đình gắn với bài “GIA ĐÌNH CỦA EM”</w:t>
+              <w:t>NLS-KT (Cơ bản 1): Sau khi hát bài “Cả nhà thương nhau”, GV chiếu phóng to tranh Khám phá của bài “Gia đình của em” và thêm vài ảnh cảnh gia đình</w:t>
             </w:r>
           </w:p>
           <w:p>
@@ -1209,7 +1248,7 @@
                 <w:i w:val="0"/>
                 <w:sz w:val="18"/>
               </w:rPr>
-              <w:t>NLS-GT (Cơ bản 1): GV dùng điện thoại của mình gọi video cho một phụ huynh đã hẹn trước để cả lớp quan sát cách chào hỏi, hỏi thăm ông bà</w:t>
+              <w:t>NLS-GT (Cơ bản 1): GV gõ lên màn hình những lời yêu thương mà HS muốn nói với người thân, thành bảng chung “Lời thương của lớp em”</w:t>
             </w:r>
           </w:p>
           <w:p>
@@ -1222,7 +1261,7 @@
                 <w:i w:val="0"/>
                 <w:sz w:val="18"/>
               </w:rPr>
-              <w:t>NLS-AT: HS chỉ gọi điện, gọi video cho người thân khi có người lớn ở bên; không nghe máy</w:t>
+              <w:t>NLS-AT: Lớp chỉ dùng ảnh chung do cô chuẩn bị</w:t>
             </w:r>
           </w:p>
           <w:p>
@@ -2509,6 +2548,45 @@
                 <w:sz w:val="18"/>
               </w:rPr>
               <w:t>QPAN: GDQP an ninh</w:t>
+            </w:r>
+          </w:p>
+          <w:p>
+            <w:pPr>
+              <w:spacing w:after="0"/>
+            </w:pPr>
+            <w:r>
+              <w:rPr>
+                <w:b w:val="0"/>
+                <w:i w:val="0"/>
+                <w:sz w:val="18"/>
+              </w:rPr>
+              <w:t>NLS-KT (Cơ bản 1): Ở bài “Giữ trật tự trong trường, lớp”, GV chiếu clip ngắn cảnh xếp hàng vào lớp ngay ngắn và cảnh chen lấn xô đẩy do thầy cô</w:t>
+            </w:r>
+          </w:p>
+          <w:p>
+            <w:pPr>
+              <w:spacing w:after="0"/>
+            </w:pPr>
+            <w:r>
+              <w:rPr>
+                <w:b w:val="0"/>
+                <w:i w:val="0"/>
+                <w:sz w:val="18"/>
+              </w:rPr>
+              <w:t>NLS-GQVĐ (Cơ bản 1): GV chiếu các tình huống trong lớp như bạn nói chuyện riêng, bạn chạy trong hành lang; HS chọn cách ứng xử phù hợp, máy báo đúng</w:t>
+            </w:r>
+          </w:p>
+          <w:p>
+            <w:pPr>
+              <w:spacing w:after="0"/>
+            </w:pPr>
+            <w:r>
+              <w:rPr>
+                <w:b w:val="0"/>
+                <w:i w:val="0"/>
+                <w:sz w:val="18"/>
+              </w:rPr>
+              <w:t>NLS-AT: Clip chỉ dựng lại tình huống, không quay bạn đang mắc lỗi để chiếu trước lớp</w:t>
             </w:r>
           </w:p>
           <w:p>

</xml_diff>

<commit_message>
Web: cot 7 co du Nang luc so bam bai (nen SGV) 8/9 toi
Co-Authored-By: Claude Fable 5.1 <noreply@anthropic.com>
Claude-Session: https://claude.ai/code/session_01CH3DVFLNt2eFwxeEQw5xK2
</commit_message>
<xml_diff>
--- a/assets/docs/lop1/Dao duc - Lop 1.docx
+++ b/assets/docs/lop1/Dao duc - Lop 1.docx
@@ -2248,6 +2248,19 @@
                 <w:i w:val="0"/>
                 <w:sz w:val="18"/>
               </w:rPr>
+              <w:t>Năng lực số Miền 1 (Cơ bản, bậc 1): Ở bài “Giữ trật tự trong trường, lớp”, GV chiếu clip ngắn cảnh xếp hàng vào lớp ngay ngắn và cảnh chen lấn xô đẩy do thầy cô dựng lại; Năng lực số Miền 5 (Cơ bản, bậc 1): GV chiếu các tình huống trong lớp như bạn nói chuyện riêng, bạn chạy trong hành lang; HS chọn cách ứng xử phù hợp, máy báo đúng</w:t>
+            </w:r>
+          </w:p>
+          <w:p>
+            <w:pPr>
+              <w:spacing w:after="0"/>
+            </w:pPr>
+            <w:r>
+              <w:rPr>
+                <w:b w:val="0"/>
+                <w:i w:val="0"/>
+                <w:sz w:val="18"/>
+              </w:rPr>
               <w:t>GDĐP: Lồng ghép GDĐP</w:t>
             </w:r>
           </w:p>
@@ -2262,19 +2275,6 @@
                 <w:sz w:val="18"/>
               </w:rPr>
               <w:t>QPAN: GDQP an ninh</w:t>
-            </w:r>
-          </w:p>
-          <w:p>
-            <w:pPr>
-              <w:spacing w:after="0"/>
-            </w:pPr>
-            <w:r>
-              <w:rPr>
-                <w:b w:val="0"/>
-                <w:i w:val="0"/>
-                <w:sz w:val="18"/>
-              </w:rPr>
-              <w:t>NLS-KT (Cơ bản 1): Ở bài “Giữ trật tự trong trường, lớp”, GV chiếu clip ngắn cảnh xếp hàng vào lớp ngay ngắn.</w:t>
             </w:r>
           </w:p>
           <w:p>

</xml_diff>

<commit_message>
Web: cot 7 NLS chon loc du 35 tuan (ban 162)
Co-Authored-By: Claude Fable 5.1 <noreply@anthropic.com>
Claude-Session: https://claude.ai/code/session_01CH3DVFLNt2eFwxeEQw5xK2
</commit_message>
<xml_diff>
--- a/assets/docs/lop1/Dao duc - Lop 1.docx
+++ b/assets/docs/lop1/Dao duc - Lop 1.docx
@@ -884,7 +884,7 @@
                 <w:i w:val="0"/>
                 <w:sz w:val="18"/>
               </w:rPr>
-              <w:t>NLS-KT (Cơ bản 1): Chiếu phóng to tranh Khám phá của bài “Em tắm, gội sạch sẽ” cho HS so sánh hai bạn trong tranh.</w:t>
+              <w:t>Năng lực số Miền 1 (Cơ bản, bậc 1): GV chiếu phóng to tranh Khám phá của bài “Em tắm, gội sạch sẽ” cho HS so sánh hai bạn trong tranh; Năng lực số Miền 5 (Cơ bản, bậc 1): GV mở bài tập tương tác kéo các bước tắm, gội về đúng thứ tự; máy báo đúng, sai ngay nên HS tự nhận ra chỗ xếp nhầm và sắp lại</w:t>
             </w:r>
           </w:p>
         </w:tc>
@@ -1001,7 +1001,7 @@
                 <w:i w:val="0"/>
                 <w:sz w:val="18"/>
               </w:rPr>
-              <w:t>NLS-GQVĐ (Cơ bản 1): Mở bài tập tương tác sắp các bước mặc áo và chỉnh trang phục theo đúng thứ tự.</w:t>
+              <w:t>Năng lực số Miền 1 (Cơ bản, bậc 1): GV chiếu phóng to tranh Khám phá của bài “Em giữ trang phục gọn gàng, sạch sẽ” và thêm vài ảnh thật: áo bỏ trong quần, cổ áo lật ngay ngắn; Năng lực số Miền 5 (Cơ bản, bậc 1): GV mở bài tập tương tác sắp các bước mặc áo và chỉnh trang phục theo đúng thứ tự: mặc áo, cài cúc từ dưới lên, bỏ áo vào quần, chỉnh cổ áo</w:t>
             </w:r>
           </w:p>
           <w:p>
@@ -2404,7 +2404,7 @@
                 <w:i w:val="0"/>
                 <w:sz w:val="18"/>
               </w:rPr>
-              <w:t>NLS-GQVĐ (Cơ bản 1): Ở hoạt động Luyện tập, GV mở trên máy chiếu bài tập kéo thả.</w:t>
+              <w:t>Năng lực số Miền 1 (Cơ bản, bậc 1): Ở hoạt động Khám phá bài “Giữ gìn tài sản của trường, lớp”, GV chiếu lên màn hình bộ ảnh chụp ngay tại trường mình: bộ bàn ghế còn lành và bộ bàn bị…; Năng lực số Miền 5 (Cơ bản, bậc 1): Ở hoạt động Luyện tập, GV mở trên máy chiếu bài tập kéo thả: các bức tranh việc làm hiện ra, HS lên bảng kéo tranh vào cột “Nên làm” hoặc “Không nên làm”</w:t>
             </w:r>
           </w:p>
           <w:p>
@@ -2534,7 +2534,7 @@
                 <w:i w:val="0"/>
                 <w:sz w:val="18"/>
               </w:rPr>
-              <w:t>NLS-KT (Cơ bản 1): Ở hoạt động Khám phá bài “Giữ vệ sinh trường, lớp”, GV chiếu ảnh chụp chính lớp mình lúc đầu buổi và.</w:t>
+              <w:t>Năng lực số Miền 1 (Cơ bản, bậc 1): Ở hoạt động Khám phá bài “Giữ vệ sinh trường, lớp”, GV chiếu ảnh chụp chính lớp mình lúc đầu buổi và sau khi trực nhật, phóng to góc để chổi; Năng lực số Miền 5 (Cơ bản, bậc 1): Ở hoạt động Luyện tập, GV mở bài tập tương tác phân loại rác trên máy chiếu: máy hiện lần lượt vỏ hộp sữa, giấy vụn, lá cây</w:t>
             </w:r>
           </w:p>
           <w:p>
@@ -2664,7 +2664,7 @@
                 <w:i w:val="0"/>
                 <w:sz w:val="18"/>
               </w:rPr>
-              <w:t>NLS-GQVĐ (Cơ bản 1): Ở hoạt động Luyện tập, GV mở bài tập tương tác sắp xếp đồ dùng.</w:t>
+              <w:t>Năng lực số Miền 1 (Cơ bản, bậc 1): Ở hoạt động Khám phá bài “Gọn gàng, ngăn nắp”, GV chiếu hai ảnh chụp cùng một góc học tập: lúc sách vở để lộn xộn và lúc đã xếp gọn; Năng lực số Miền 5 (Cơ bản, bậc 1): Ở hoạt động Luyện tập, GV mở bài tập tương tác sắp xếp đồ dùng: máy hiện bàn học bừa bộn, HS kéo từng thứ về đúng chỗ là giá sách, hộp bút</w:t>
             </w:r>
           </w:p>
           <w:p>
@@ -3195,7 +3195,7 @@
                 <w:i w:val="0"/>
                 <w:sz w:val="18"/>
               </w:rPr>
-              <w:t>NLS-KT (Cơ bản 1): Ở hoạt động Khám phá bài “Tự giác tham gia các hoạt động ở trường”, GV chiếu ảnh chụp chính các hoạt động của trường mình.</w:t>
+              <w:t>Năng lực số Miền 1 (Cơ bản, bậc 1): Ở hoạt động Khám phá bài “Tự giác tham gia các hoạt động ở trường”, GV chiếu ảnh chụp chính các hoạt động của trường mình: kế hoạch nhỏ, chăm sóc bồn hoa; Năng lực số Miền 5 (Cơ bản, bậc 1): Ở hoạt động Luyện tập, GV mở bài tập tương tác: máy hiện các việc chung ở trường, HS chọn việc vừa sức mình có thể tự giác làm rồi bấm kiểm tra</w:t>
             </w:r>
           </w:p>
           <w:p>
@@ -3325,7 +3325,7 @@
                 <w:i w:val="0"/>
                 <w:sz w:val="18"/>
               </w:rPr>
-              <w:t>NLS-GQVĐ (Cơ bản 1): Ở hoạt động Luyện tập, GV mở bài tập tương tác phân loại.</w:t>
+              <w:t>Năng lực số Miền 1 (Cơ bản, bậc 1): Ở hoạt động Khám phá bài “Tự giác làm việc nhà”, GV chiếu bộ ảnh những việc nhà vừa sức với HS lớp 1: gấp quần áo, tưới cây, nhặt rau, xếp dép; Năng lực số Miền 5 (Cơ bản, bậc 1): Ở hoạt động Luyện tập, GV mở bài tập tương tác phân loại: máy hiện lần lượt các việc nhà, HS chọn việc vừa sức và an toàn hay việc phải nhờ người lớn…</w:t>
             </w:r>
           </w:p>
           <w:p>
@@ -4663,7 +4663,7 @@
                 <w:i w:val="0"/>
                 <w:sz w:val="18"/>
               </w:rPr>
-              <w:t>NLS-GQVĐ (Cơ bản 1): Nêu và làm mẫu cách người lớn quét mã trên bao bì để tra thông tin sản phẩm.</w:t>
+              <w:t>Năng lực số Miền 1 (Cơ bản, bậc 1): GV chiếu ảnh phóng to nhãn một gói bánh, hộp sữa lên màn hình, chỉ cho HS chỗ ghi hạn sử dụng và hướng dẫn HS đọc số ngày tháng ghi ở đó; Năng lực số Miền 5 (Cơ bản, bậc 1): GV nêu và làm mẫu cách người lớn quét mã trên bao bì để tra thông tin sản phẩm; HS quan sát GV thao tác và nói lại việc cần làm trước khi ăn…</w:t>
             </w:r>
           </w:p>
         </w:tc>

</xml_diff>

<commit_message>
Đồng bộ hai website theo app bản 192 (KHGD chữ in hoa → chữ thường)
Chạy _khgd-app-to-web.py cho lớp 1–5 sau khi app đổi 3.629 ô Chủ đề/Tên bài từ chữ
in hoa về chữ thường (giữ tên riêng, viết tắt, số La Mã). Cột 7 lấy từ _cot7-day.json
xuất lại cùng ngày. Đo web-vs-app: 102 lượt môn, 0 dòng lệch ở cả website và web-chung.

Co-Authored-By: Claude Opus 5 (1M context) <noreply@anthropic.com>
Claude-Session: https://claude.ai/code/session_014ucMYKvcHtg5qiGKrbLvpM
</commit_message>
<xml_diff>
--- a/assets/docs/lop1/Dao duc - Lop 1.docx
+++ b/assets/docs/lop1/Dao duc - Lop 1.docx
@@ -566,7 +566,7 @@
                 <w:i w:val="0"/>
                 <w:sz w:val="20"/>
               </w:rPr>
-              <w:t>CĐ 1: TỰ CHĂM SÓC</w:t>
+              <w:t>CĐ 1: Tự chăm sóc</w:t>
             </w:r>
           </w:p>
         </w:tc>
@@ -696,7 +696,7 @@
                 <w:i w:val="0"/>
                 <w:sz w:val="20"/>
               </w:rPr>
-              <w:t>CĐ 1: TỰ CHĂM SÓC</w:t>
+              <w:t>CĐ 1: Tự chăm sóc</w:t>
             </w:r>
           </w:p>
         </w:tc>
@@ -826,7 +826,7 @@
                 <w:i w:val="0"/>
                 <w:sz w:val="20"/>
               </w:rPr>
-              <w:t>CĐ 1: TỰ CHĂM SÓC</w:t>
+              <w:t>CĐ 1: Tự chăm sóc</w:t>
             </w:r>
           </w:p>
         </w:tc>
@@ -943,7 +943,7 @@
                 <w:i w:val="0"/>
                 <w:sz w:val="20"/>
               </w:rPr>
-              <w:t>CĐ 1: TỰ CHĂM SÓC</w:t>
+              <w:t>CĐ 1: Tự chăm sóc</w:t>
             </w:r>
           </w:p>
         </w:tc>
@@ -1073,7 +1073,7 @@
                 <w:i w:val="0"/>
                 <w:sz w:val="20"/>
               </w:rPr>
-              <w:t>CĐ 2: YÊU THƯƠNG</w:t>
+              <w:t>CĐ 2: Yêu thương</w:t>
             </w:r>
           </w:p>
         </w:tc>
@@ -1203,7 +1203,7 @@
                 <w:i w:val="0"/>
                 <w:sz w:val="20"/>
               </w:rPr>
-              <w:t>CĐ 2: YÊU THƯƠNG</w:t>
+              <w:t>CĐ 2: Yêu thương</w:t>
             </w:r>
           </w:p>
         </w:tc>
@@ -1320,7 +1320,7 @@
                 <w:i w:val="0"/>
                 <w:sz w:val="20"/>
               </w:rPr>
-              <w:t>CĐ 3: QUAN TÂM CHĂM SÓC NGƯỜI THÂN TRONG GIA ĐÌNH</w:t>
+              <w:t>CĐ 3: Quan tâm chăm sóc người thân trong gia đình</w:t>
             </w:r>
           </w:p>
         </w:tc>
@@ -1437,7 +1437,7 @@
                 <w:i w:val="0"/>
                 <w:sz w:val="20"/>
               </w:rPr>
-              <w:t>CĐ 3: QUAN TÂM CHĂM SÓC NGƯỜI THÂN TRONG GIA ĐÌNH</w:t>
+              <w:t>CĐ 3: Quan tâm chăm sóc người thân trong gia đình</w:t>
             </w:r>
           </w:p>
         </w:tc>
@@ -1554,7 +1554,7 @@
                 <w:i w:val="0"/>
                 <w:sz w:val="20"/>
               </w:rPr>
-              <w:t>CĐ 3: QUAN TÂM CHĂM SÓC NGƯỜI THÂN TRONG GIA ĐÌNH</w:t>
+              <w:t>CĐ 3: Quan tâm chăm sóc người thân trong gia đình</w:t>
             </w:r>
           </w:p>
         </w:tc>
@@ -1671,7 +1671,7 @@
                 <w:i w:val="0"/>
                 <w:sz w:val="20"/>
               </w:rPr>
-              <w:t>CĐ 3: QUAN TÂM CHĂM SÓC NGƯỜI THÂN TRONG GIA ĐÌNH</w:t>
+              <w:t>CĐ 3: Quan tâm chăm sóc người thân trong gia đình</w:t>
             </w:r>
           </w:p>
         </w:tc>
@@ -1801,7 +1801,7 @@
                 <w:i w:val="0"/>
                 <w:sz w:val="20"/>
               </w:rPr>
-              <w:t>CĐ 3: QUAN TÂM CHĂM SÓC NGƯỜI THÂN TRONG GIA ĐÌNH</w:t>
+              <w:t>CĐ 3: Quan tâm chăm sóc người thân trong gia đình</w:t>
             </w:r>
           </w:p>
         </w:tc>
@@ -1917,7 +1917,7 @@
                 <w:i w:val="0"/>
                 <w:sz w:val="20"/>
               </w:rPr>
-              <w:t>CĐ4: THỰC HIỆN NỘI QUY TRƯỜNG LỚP</w:t>
+              <w:t>CĐ4: Thực hiện nội quy trường lớp</w:t>
             </w:r>
           </w:p>
         </w:tc>
@@ -2073,7 +2073,7 @@
                 <w:i w:val="0"/>
                 <w:sz w:val="20"/>
               </w:rPr>
-              <w:t>CĐ4: THỰC HIỆN NỘI QUY TRƯỜNG LỚP</w:t>
+              <w:t>CĐ4: Thực hiện nội quy trường lớp</w:t>
             </w:r>
           </w:p>
         </w:tc>
@@ -2190,7 +2190,7 @@
                 <w:i w:val="0"/>
                 <w:sz w:val="20"/>
               </w:rPr>
-              <w:t>CĐ4: THỰC HIỆN NỘI QUY TRƯỜNG LỚP</w:t>
+              <w:t>CĐ4: Thực hiện nội quy trường lớp</w:t>
             </w:r>
           </w:p>
         </w:tc>
@@ -2346,7 +2346,7 @@
                 <w:i w:val="0"/>
                 <w:sz w:val="20"/>
               </w:rPr>
-              <w:t>CĐ4: THỰC HIỆN NỘI QUY TRƯỜNG LỚP</w:t>
+              <w:t>CĐ4: Thực hiện nội quy trường lớp</w:t>
             </w:r>
           </w:p>
         </w:tc>
@@ -2476,7 +2476,7 @@
                 <w:i w:val="0"/>
                 <w:sz w:val="20"/>
               </w:rPr>
-              <w:t>CĐ4: THỰC HIỆN NỘI QUY TRƯỜNG LỚP</w:t>
+              <w:t>CĐ4: Thực hiện nội quy trường lớp</w:t>
             </w:r>
           </w:p>
         </w:tc>
@@ -2606,7 +2606,7 @@
                 <w:i w:val="0"/>
                 <w:sz w:val="20"/>
               </w:rPr>
-              <w:t>CĐ 5: SINH HOẠT NỀN NẾP</w:t>
+              <w:t>CĐ 5: Sinh hoạt nền nếp</w:t>
             </w:r>
           </w:p>
         </w:tc>
@@ -2736,7 +2736,7 @@
                 <w:i w:val="0"/>
                 <w:sz w:val="20"/>
               </w:rPr>
-              <w:t>CĐ 5: SINH HOẠT NỀN NẾP</w:t>
+              <w:t>CĐ 5: Sinh hoạt nền nếp</w:t>
             </w:r>
           </w:p>
         </w:tc>
@@ -2877,7 +2877,7 @@
                 <w:i w:val="0"/>
                 <w:sz w:val="20"/>
               </w:rPr>
-              <w:t>CĐ 5: SINH HOẠT NỀN NẾP</w:t>
+              <w:t>CĐ 5: Sinh hoạt nền nếp</w:t>
             </w:r>
           </w:p>
         </w:tc>
@@ -3007,7 +3007,7 @@
                 <w:i w:val="0"/>
                 <w:sz w:val="20"/>
               </w:rPr>
-              <w:t>CĐ 6: TỰ GIÁC LÀM VIỆC CỦA MÌNH</w:t>
+              <w:t>CĐ 6: Tự giác làm việc của mình</w:t>
             </w:r>
           </w:p>
         </w:tc>
@@ -3137,7 +3137,7 @@
                 <w:i w:val="0"/>
                 <w:sz w:val="20"/>
               </w:rPr>
-              <w:t>CĐ 6: TỰ GIÁC LÀM VIỆC CỦA MÌNH</w:t>
+              <w:t>CĐ 6: Tự giác làm việc của mình</w:t>
             </w:r>
           </w:p>
         </w:tc>
@@ -3267,7 +3267,7 @@
                 <w:i w:val="0"/>
                 <w:sz w:val="20"/>
               </w:rPr>
-              <w:t>CĐ 6: TỰ GIÁC LÀM VIỆC CỦA MÌNH</w:t>
+              <w:t>CĐ 6: Tự giác làm việc của mình</w:t>
             </w:r>
           </w:p>
         </w:tc>
@@ -3397,7 +3397,7 @@
                 <w:i w:val="0"/>
                 <w:sz w:val="20"/>
               </w:rPr>
-              <w:t>CĐ 7: THẬT THÀ</w:t>
+              <w:t>CĐ 7: Thật thà</w:t>
             </w:r>
           </w:p>
         </w:tc>
@@ -3527,7 +3527,7 @@
                 <w:i w:val="0"/>
                 <w:sz w:val="20"/>
               </w:rPr>
-              <w:t>CĐ 7: THẬT THÀ</w:t>
+              <w:t>CĐ 7: Thật thà</w:t>
             </w:r>
           </w:p>
         </w:tc>
@@ -3644,7 +3644,7 @@
                 <w:i w:val="0"/>
                 <w:sz w:val="20"/>
               </w:rPr>
-              <w:t>CĐ 7: THẬT THÀ</w:t>
+              <w:t>CĐ 7: Thật thà</w:t>
             </w:r>
           </w:p>
         </w:tc>
@@ -3761,7 +3761,7 @@
                 <w:i w:val="0"/>
                 <w:sz w:val="20"/>
               </w:rPr>
-              <w:t>CĐ 7: THẬT THÀ</w:t>
+              <w:t>CĐ 7: Thật thà</w:t>
             </w:r>
           </w:p>
         </w:tc>
@@ -3891,7 +3891,7 @@
                 <w:i w:val="0"/>
                 <w:sz w:val="20"/>
               </w:rPr>
-              <w:t>CĐ 7: THẬT THÀ</w:t>
+              <w:t>CĐ 7: Thật thà</w:t>
             </w:r>
           </w:p>
         </w:tc>
@@ -4007,7 +4007,7 @@
                 <w:i w:val="0"/>
                 <w:sz w:val="20"/>
               </w:rPr>
-              <w:t>CĐ 8: PHÒNG TRÁNH TAI NẠN, THƯƠNG TÍCH</w:t>
+              <w:t>CĐ 8: Phòng tránh tai nạn, thương tích</w:t>
             </w:r>
           </w:p>
         </w:tc>
@@ -4137,7 +4137,7 @@
                 <w:i w:val="0"/>
                 <w:sz w:val="20"/>
               </w:rPr>
-              <w:t>CĐ 8: PHÒNG TRÁNH TAI NẠN, THƯƠNG TÍCH</w:t>
+              <w:t>CĐ 8: Phòng tránh tai nạn, thương tích</w:t>
             </w:r>
           </w:p>
         </w:tc>
@@ -4254,7 +4254,7 @@
                 <w:i w:val="0"/>
                 <w:sz w:val="20"/>
               </w:rPr>
-              <w:t>CĐ 8: PHÒNG TRÁNH TAI NẠN, THƯƠNG TÍCH</w:t>
+              <w:t>CĐ 8: Phòng tránh tai nạn, thương tích</w:t>
             </w:r>
           </w:p>
         </w:tc>
@@ -4371,7 +4371,7 @@
                 <w:i w:val="0"/>
                 <w:sz w:val="20"/>
               </w:rPr>
-              <w:t>CĐ 8: PHÒNG TRÁNH TAI NẠN, THƯƠNG TÍCH</w:t>
+              <w:t>CĐ 8: Phòng tránh tai nạn, thương tích</w:t>
             </w:r>
           </w:p>
         </w:tc>
@@ -4488,7 +4488,7 @@
                 <w:i w:val="0"/>
                 <w:sz w:val="20"/>
               </w:rPr>
-              <w:t>CĐ 8: PHÒNG TRÁNH TAI NẠN, THƯƠNG TÍCH</w:t>
+              <w:t>CĐ 8: Phòng tránh tai nạn, thương tích</w:t>
             </w:r>
           </w:p>
         </w:tc>
@@ -4605,7 +4605,7 @@
                 <w:i w:val="0"/>
                 <w:sz w:val="20"/>
               </w:rPr>
-              <w:t>CĐ 8: PHÒNG TRÁNH TAI NẠN, THƯƠNG TÍCH</w:t>
+              <w:t>CĐ 8: Phòng tránh tai nạn, thương tích</w:t>
             </w:r>
           </w:p>
         </w:tc>
@@ -4722,7 +4722,7 @@
                 <w:i w:val="0"/>
                 <w:sz w:val="20"/>
               </w:rPr>
-              <w:t>CĐ 8: PHÒNG TRÁNH TAI NẠN, THƯƠNG TÍCH</w:t>
+              <w:t>CĐ 8: Phòng tránh tai nạn, thương tích</w:t>
             </w:r>
           </w:p>
         </w:tc>
@@ -4865,7 +4865,7 @@
                 <w:i w:val="0"/>
                 <w:sz w:val="20"/>
               </w:rPr>
-              <w:t>CĐ 8: PHÒNG TRÁNH TAI NẠN, THƯƠNG TÍCH</w:t>
+              <w:t>CĐ 8: Phòng tránh tai nạn, thương tích</w:t>
             </w:r>
           </w:p>
         </w:tc>

</xml_diff>